<commit_message>
Remove em/en dashes so documents read as human-written
- Replace em dashes with commas/colons and use plain hyphens for number
  ranges across the prompt, README, checklist, and Commission Accrual case
  (HTML + regenerated .docx)
- Add a writing-style rule to the reusable prompt instructing future
  business cases to avoid em/en dashes and stock AI phrasing

Co-Authored-By: Claude Opus 4.8 <noreply@anthropic.com>
Claude-Session: https://claude.ai/code/session_01HHsAsYdTSfaBLKbhDayXUH
</commit_message>
<xml_diff>
--- a/cases/case-commission-accrual-automation.docx
+++ b/cases/case-commission-accrual-automation.docx
@@ -52,7 +52,7 @@
                 <w:color w:val="DCECF6"/>
                 <w:sz w:val="21"/>
               </w:rPr>
-              <w:t>Solution 1 — Automating the monthly commission accrual process to produce accounting-ready, audit-supported, executive-friendly reporting.</w:t>
+              <w:t>Solution 1: Automating the monthly commission accrual process to produce accounting-ready, audit-supported, executive-friendly reporting.</w:t>
             </w:r>
           </w:p>
         </w:tc>
@@ -273,7 +273,7 @@
                 <w:color w:val="1F2933"/>
                 <w:sz w:val="19"/>
               </w:rPr>
-              <w:t>Draft — For Review</w:t>
+              <w:t>Draft / For Review</w:t>
             </w:r>
           </w:p>
         </w:tc>
@@ -316,14 +316,6 @@
       </w:pPr>
       <w:r>
         <w:rPr>
-          <w:b w:val="0"/>
-          <w:i w:val="0"/>
-          <w:color w:val="1F2933"/>
-          <w:sz w:val="21"/>
-        </w:rPr>
-      </w:r>
-      <w:r>
-        <w:rPr>
           <w:b/>
           <w:i w:val="0"/>
           <w:color w:val="003C71"/>
@@ -347,14 +339,6 @@
       </w:pPr>
       <w:r>
         <w:rPr>
-          <w:b w:val="0"/>
-          <w:i w:val="0"/>
-          <w:color w:val="1F2933"/>
-          <w:sz w:val="21"/>
-        </w:rPr>
-      </w:r>
-      <w:r>
-        <w:rPr>
           <w:b/>
           <w:i w:val="0"/>
           <w:color w:val="003C71"/>
@@ -369,7 +353,7 @@
           <w:color w:val="1F2933"/>
           <w:sz w:val="21"/>
         </w:rPr>
-        <w:t>Approval of an estimated one-time implementation investment of ~$45,000 and ~$4,000/year recurring cost, delivered over an estimated 3–4 month timeline. All dollar figures are estimates pending validated inputs.</w:t>
+        <w:t>Approval of an estimated one-time implementation investment of about $45,000 and about $4,000/year recurring cost, delivered over an estimated 3 to 4 month timeline. All dollar figures are estimates pending validated inputs.</w:t>
       </w:r>
     </w:p>
     <w:tbl>
@@ -616,7 +600,7 @@
           <w:color w:val="1F2933"/>
           <w:sz w:val="21"/>
         </w:rPr>
-        <w:t>Beyond the quantified return, the strongest drivers are audit readiness, reduced financial-misstatement risk, and standardized executive reporting — benefits that are strategic rather than purely cost-based. Automation converts several senior-analyst days each month into reliable, repeatable output that Accounting can book directly.</w:t>
+        <w:t>Beyond the quantified return, the strongest drivers are audit readiness, reduced financial-misstatement risk, and standardized executive reporting. These are strategic benefits rather than purely cost-based ones. Automation converts several senior-analyst days each month into reliable, repeatable output that Accounting can book directly.</w:t>
       </w:r>
     </w:p>
     <w:tbl>
@@ -647,7 +631,7 @@
                 <w:color w:val="C77700"/>
                 <w:sz w:val="21"/>
               </w:rPr>
-              <w:t>⚠ Note on financials</w:t>
+              <w:t>Note on financials</w:t>
             </w:r>
           </w:p>
           <w:p>
@@ -658,7 +642,7 @@
                 <w:color w:val="1F2933"/>
                 <w:sz w:val="20"/>
               </w:rPr>
-              <w:t>All dollar figures in this document are illustrative estimates built to complete the business case in the absence of confirmed cost/benefit data. Replace them with actual implementation quotes, the fully-loaded analyst rate, measured effort hours, and the finance-approved discount rate before submitting for approval. See Section 14 — Assumptions &amp; Open Questions.</w:t>
+              <w:t>All dollar figures in this document are illustrative estimates built to complete the business case in the absence of confirmed cost/benefit data. Replace them with actual implementation quotes, the fully-loaded analyst rate, measured effort hours, and the finance-approved discount rate before submitting for approval. See Section 14, Assumptions and Open Questions.</w:t>
             </w:r>
           </w:p>
         </w:tc>
@@ -692,7 +676,7 @@
           <w:color w:val="00539B"/>
           <w:sz w:val="28"/>
         </w:rPr>
-        <w:t>Problem &amp; Opportunity</w:t>
+        <w:t>Problem and Opportunity</w:t>
       </w:r>
     </w:p>
     <w:p>
@@ -706,7 +690,7 @@
           <w:color w:val="1F2933"/>
           <w:sz w:val="21"/>
         </w:rPr>
-        <w:t>Every month, Commercial Analytics generates commission reports. The process owner (Stephen) is notified, downloads the files, and manually assembles the accrual in Excel from two workbooks — Commissions Payment Made and Commissions Payment Remaining. Producing the accounting-ready workbook currently requires:</w:t>
+        <w:t>Every month, Commercial Analytics generates commission reports. The process owner (Stephen) is notified, downloads the files, and manually assembles the accrual in Excel from two workbooks: Commissions Payment Made and Commissions Payment Remaining. Producing the accounting-ready workbook currently requires:</w:t>
       </w:r>
     </w:p>
     <w:p>
@@ -855,7 +839,7 @@
           <w:color w:val="1F2933"/>
           <w:sz w:val="21"/>
         </w:rPr>
-        <w:t>Large, slow Excel files; no executive-level reporting</w:t>
+        <w:t>Large, slow Excel files and no executive-level reporting</w:t>
       </w:r>
     </w:p>
     <w:p>
@@ -870,7 +854,7 @@
           <w:color w:val="1F2933"/>
           <w:sz w:val="21"/>
         </w:rPr>
-        <w:t>Time spent maintaining spreadsheets instead of analyzing financials; elevated error risk on a booked accrual</w:t>
+        <w:t>Time spent maintaining spreadsheets instead of analyzing financials, with elevated error risk on a booked accrual</w:t>
       </w:r>
     </w:p>
     <w:tbl>
@@ -912,7 +896,7 @@
                 <w:color w:val="1F2933"/>
                 <w:sz w:val="20"/>
               </w:rPr>
-              <w:t>The process continues to consume an estimated 3–4 senior-analyst days per month, remains error-prone at the point of a financially material accrual, and offers no standardized audit trail or executive reporting. The fragility grows as transaction volumes rise, and knowledge remains concentrated in a single person.</w:t>
+              <w:t>The process continues to consume an estimated 3 to 4 senior-analyst days per month, remains error-prone at the point of a financially material accrual, and offers no standardized audit trail or executive reporting. The fragility grows as transaction volumes rise, and knowledge remains concentrated in a single person.</w:t>
             </w:r>
           </w:p>
         </w:tc>
@@ -975,7 +959,7 @@
           <w:color w:val="1F2933"/>
           <w:sz w:val="21"/>
         </w:rPr>
-        <w:t>Continuous improvement / lean: eliminates repetitive, low-value manual work and standardizes a recurring close activity.</w:t>
+        <w:t>Continuous improvement and lean: eliminates repetitive, low-value manual work and standardizes a recurring close activity.</w:t>
       </w:r>
     </w:p>
     <w:p>
@@ -990,7 +974,7 @@
           <w:color w:val="1F2933"/>
           <w:sz w:val="21"/>
         </w:rPr>
-        <w:t>Quality &amp; problem-solving: removes fragile pivot/formula dependencies that are a root cause of month-end errors.</w:t>
+        <w:t>Quality and problem-solving: removes fragile pivot/formula dependencies that are a root cause of month-end errors.</w:t>
       </w:r>
     </w:p>
     <w:p>
@@ -1019,7 +1003,7 @@
           <w:color w:val="1F2933"/>
           <w:sz w:val="21"/>
         </w:rPr>
-        <w:t>It also supports [STRATEGIC PRIORITY] — the specific organizational priority this initiative rolls up to (e.g., finance transformation, close-cycle efficiency, or control/audit strengthening). Confirm and insert the correct pillar.</w:t>
+        <w:t>It also supports [STRATEGIC PRIORITY], the specific organizational priority this initiative rolls up to (for example finance transformation, close-cycle efficiency, or control/audit strengthening). Confirm and insert the correct pillar.</w:t>
       </w:r>
     </w:p>
     <w:p>
@@ -1045,7 +1029,7 @@
           <w:color w:val="00539B"/>
           <w:sz w:val="28"/>
         </w:rPr>
-        <w:t>Proposed Solution &amp; Scope</w:t>
+        <w:t>Proposed Solution and Scope</w:t>
       </w:r>
     </w:p>
     <w:p>
@@ -1059,7 +1043,7 @@
           <w:color w:val="1F2933"/>
           <w:sz w:val="21"/>
         </w:rPr>
-        <w:t>Build an automated solution that ingests the two commission workbooks, validates and maps the data, applies the established commission logic, and generates a single new, accounting-ready output workbook — never overwriting the source files.</w:t>
+        <w:t>Build an automated solution that ingests the two commission workbooks, validates and maps the data, applies the established commission logic, and generates a single new, accounting-ready output workbook without overwriting the source files.</w:t>
       </w:r>
     </w:p>
     <w:p>
@@ -1088,7 +1072,7 @@
           <w:color w:val="1F2933"/>
           <w:sz w:val="21"/>
         </w:rPr>
-        <w:t>Guided workbook mapping: proposes which file is Payment Made vs Payment Remaining and requires user confirmation before processing — never assumes the mapping.</w:t>
+        <w:t>Guided workbook mapping: proposes which file is Payment Made vs Payment Remaining and requires user confirmation before processing. It never assumes the mapping.</w:t>
       </w:r>
     </w:p>
     <w:p>
@@ -1103,7 +1087,7 @@
           <w:color w:val="1F2933"/>
           <w:sz w:val="21"/>
         </w:rPr>
-        <w:t>Automated validation: required columns, missing Cost Centers / Bill-To Account Numbers, blank/invalid/negative values, duplicates; reports imported row counts and whether screenshots are included.</w:t>
+        <w:t>Automated validation: required columns, missing Cost Centers or Bill-To Account Numbers, blank/invalid/negative values, and duplicates; reports imported row counts and whether screenshots are included.</w:t>
       </w:r>
     </w:p>
     <w:p>
@@ -1118,7 +1102,7 @@
           <w:color w:val="1F2933"/>
           <w:sz w:val="21"/>
         </w:rPr>
-        <w:t>Fiscal-aware three-day forecast: auto-derives the fiscal divisor from the Fiscal Period (four-week → 17, five-week → 22). The user is never asked which divisor to use — only for the Fiscal Period if it cannot be determined automatically.</w:t>
+        <w:t>Fiscal-aware three-day forecast: auto-derives the fiscal divisor from the Fiscal Period (four-week uses 17, five-week uses 22). The user is never asked which divisor to use, only for the Fiscal Period if it cannot be determined automatically.</w:t>
       </w:r>
     </w:p>
     <w:p>
@@ -1133,7 +1117,7 @@
           <w:color w:val="1F2933"/>
           <w:sz w:val="21"/>
         </w:rPr>
-        <w:t>Aging analysis on Payment Remaining (Current, 31–60, 61–90, 91–180, 181–365, Over 365 days) for visibility into outstanding liabilities.</w:t>
+        <w:t>Aging analysis on Payment Remaining (Current, 31 to 60, 61 to 90, 91 to 180, 181 to 365, Over 365 days) for visibility into outstanding liabilities.</w:t>
       </w:r>
     </w:p>
     <w:p>
@@ -1148,7 +1132,7 @@
           <w:color w:val="1F2933"/>
           <w:sz w:val="21"/>
         </w:rPr>
-        <w:t>Audit evidence preservation: Oracle BI screenshot sheets copied into the output with original formatting — no OCR, no interpretation, no row-count comparison.</w:t>
+        <w:t>Audit evidence preservation: Oracle BI screenshot sheets copied into the output with original formatting. No OCR, no interpretation, no row-count comparison.</w:t>
       </w:r>
     </w:p>
     <w:p>
@@ -1163,7 +1147,7 @@
           <w:color w:val="1F2933"/>
           <w:sz w:val="21"/>
         </w:rPr>
-        <w:t>Executive dashboard &amp; AI commentary: KPI cards, accrual by month, top cost centers/accounts, Payment Made vs Remaining split, aging distribution, and a data-supported narrative (no speculation). Charts use summarized data only.</w:t>
+        <w:t>Executive dashboard and AI commentary: KPI cards, accrual by month, top cost centers/accounts, Payment Made vs Remaining split, aging distribution, and a data-supported narrative (no speculation). Charts use summarized data only.</w:t>
       </w:r>
     </w:p>
     <w:p>
@@ -1191,7 +1175,7 @@
           <w:color w:val="1F2933"/>
           <w:sz w:val="21"/>
         </w:rPr>
-        <w:t>Executive Summary · Configuration · Month-Year Summary · Cost Center Summary · Cost Center + Account Summary (primary booking view) · Account Summary · Aging Summary · Payment Made Detail · Payment Remaining Detail · Validation Report · Audit Evidence · Executive Dashboard.</w:t>
+        <w:t>Executive Summary, Configuration, Month-Year Summary, Cost Center Summary, Cost Center plus Account Summary (primary booking view), Account Summary, Aging Summary, Payment Made Detail, Payment Remaining Detail, Validation Report, Audit Evidence, and Executive Dashboard.</w:t>
       </w:r>
     </w:p>
     <w:p>
@@ -1296,7 +1280,7 @@
                 <w:color w:val="1F2933"/>
                 <w:sz w:val="19"/>
               </w:rPr>
-              <w:t>Sum of Commission Amount (payable now — customer payment received)</w:t>
+              <w:t>Sum of Commission Amount (payable now, customer payment received)</w:t>
             </w:r>
           </w:p>
         </w:tc>
@@ -1338,7 +1322,7 @@
                 <w:color w:val="1F2933"/>
                 <w:sz w:val="19"/>
               </w:rPr>
-              <w:t>Sum of Commission Amount (future liability — payment not yet received)</w:t>
+              <w:t>Sum of Commission Amount (future liability, payment not yet received)</w:t>
             </w:r>
           </w:p>
         </w:tc>
@@ -1378,7 +1362,7 @@
                 <w:color w:val="1F2933"/>
                 <w:sz w:val="19"/>
               </w:rPr>
-              <w:t>(Payment Made Total ÷ Fiscal Divisor) × 3 remaining business days</w:t>
+              <w:t>(Payment Made Total / Fiscal Divisor) x 3 remaining business days</w:t>
             </w:r>
           </w:p>
         </w:tc>
@@ -1457,7 +1441,7 @@
           <w:color w:val="1F2933"/>
           <w:sz w:val="21"/>
         </w:rPr>
-        <w:t>Payment Made &amp; Payment Remaining workbooks</w:t>
+        <w:t>Payment Made and Payment Remaining workbooks</w:t>
       </w:r>
     </w:p>
     <w:p>
@@ -1502,7 +1486,7 @@
           <w:color w:val="1F2933"/>
           <w:sz w:val="21"/>
         </w:rPr>
-        <w:t>Audit-evidence preservation; accounting-ready output workbook</w:t>
+        <w:t>Audit-evidence preservation and accounting-ready output workbook</w:t>
       </w:r>
     </w:p>
     <w:p>
@@ -1516,7 +1500,7 @@
           <w:color w:val="003C71"/>
           <w:sz w:val="22"/>
         </w:rPr>
-        <w:t>Out of scope (→ Solution 2)</w:t>
+        <w:t>Out of scope (goes to Solution 2)</w:t>
       </w:r>
     </w:p>
     <w:p>
@@ -1546,7 +1530,7 @@
           <w:color w:val="1F2933"/>
           <w:sz w:val="21"/>
         </w:rPr>
-        <w:t>Vendor payment analysis &amp; views (by vendor / cost center / account)</w:t>
+        <w:t>Vendor payment analysis and views (by vendor, cost center, account)</w:t>
       </w:r>
     </w:p>
     <w:p>
@@ -1775,7 +1759,7 @@
                 <w:color w:val="1F2933"/>
                 <w:sz w:val="19"/>
               </w:rPr>
-              <w:t>—</w:t>
+              <w:t>None</w:t>
             </w:r>
           </w:p>
         </w:tc>
@@ -1880,7 +1864,7 @@
                 <w:color w:val="1F2933"/>
                 <w:sz w:val="19"/>
               </w:rPr>
-              <w:t>C. Purpose-built automation ✓ Recommended</w:t>
+              <w:t>C. Purpose-built automation (Recommended)</w:t>
             </w:r>
           </w:p>
         </w:tc>
@@ -1900,7 +1884,7 @@
                 <w:color w:val="1F2933"/>
                 <w:sz w:val="19"/>
               </w:rPr>
-              <w:t>Removes manual work &amp; pivots; built-in validation, forecasting, aging, dashboard, audit preservation; accounting-ready</w:t>
+              <w:t>Removes manual work and pivots; built-in validation, forecasting, aging, dashboard, audit preservation; accounting-ready</w:t>
             </w:r>
           </w:p>
         </w:tc>
@@ -1920,7 +1904,7 @@
                 <w:color w:val="1F2933"/>
                 <w:sz w:val="19"/>
               </w:rPr>
-              <w:t>Requires development &amp; UAT investment</w:t>
+              <w:t>Requires development and UAT investment</w:t>
             </w:r>
           </w:p>
         </w:tc>
@@ -2003,7 +1987,7 @@
                 <w:color w:val="1F2933"/>
                 <w:sz w:val="19"/>
               </w:rPr>
-              <w:t>High cost &amp; licensing; heavy integration; likely over-scoped</w:t>
+              <w:t>High cost and licensing; heavy integration; likely over-scoped</w:t>
             </w:r>
           </w:p>
         </w:tc>
@@ -2039,14 +2023,6 @@
       <w:pPr>
         <w:spacing w:after="60"/>
       </w:pPr>
-      <w:r>
-        <w:rPr>
-          <w:b w:val="0"/>
-          <w:i w:val="0"/>
-          <w:color w:val="1F2933"/>
-          <w:sz w:val="21"/>
-        </w:rPr>
-      </w:r>
       <w:r>
         <w:rPr>
           <w:b/>
@@ -2216,7 +2192,7 @@
                 <w:color w:val="1F2933"/>
                 <w:sz w:val="19"/>
               </w:rPr>
-              <w:t>~28 hrs/month × $65 fully-loaded rate (≈336 hrs/yr)</w:t>
+              <w:t>About 28 hrs/month at $65 fully-loaded rate (about 336 hrs/yr)</w:t>
             </w:r>
           </w:p>
         </w:tc>
@@ -2278,7 +2254,7 @@
                 <w:color w:val="1F2933"/>
                 <w:sz w:val="19"/>
               </w:rPr>
-              <w:t>Fewer accrual corrections &amp; reconciliation cycles</w:t>
+              <w:t>Fewer accrual corrections and reconciliation cycles</w:t>
             </w:r>
           </w:p>
         </w:tc>
@@ -2398,7 +2374,7 @@
           <w:color w:val="1F2933"/>
           <w:sz w:val="21"/>
         </w:rPr>
-        <w:t>Improved audit readiness &amp; standardized evidence; reduced financial-misstatement risk</w:t>
+        <w:t>Improved audit readiness and standardized evidence; reduced financial-misstatement risk</w:t>
       </w:r>
     </w:p>
     <w:p>
@@ -2476,14 +2452,6 @@
       <w:pPr>
         <w:spacing w:after="60"/>
       </w:pPr>
-      <w:r>
-        <w:rPr>
-          <w:b w:val="0"/>
-          <w:i w:val="0"/>
-          <w:color w:val="1F2933"/>
-          <w:sz w:val="21"/>
-        </w:rPr>
-      </w:r>
       <w:r>
         <w:rPr>
           <w:b w:val="0"/>
@@ -2723,7 +2691,7 @@
                 <w:color w:val="1F2933"/>
                 <w:sz w:val="19"/>
               </w:rPr>
-              <w:t>—</w:t>
+              <w:t>-</w:t>
             </w:r>
           </w:p>
         </w:tc>
@@ -2743,7 +2711,7 @@
                 <w:color w:val="1F2933"/>
                 <w:sz w:val="19"/>
               </w:rPr>
-              <w:t>—</w:t>
+              <w:t>-</w:t>
             </w:r>
           </w:p>
         </w:tc>
@@ -2763,7 +2731,7 @@
                 <w:color w:val="1F2933"/>
                 <w:sz w:val="19"/>
               </w:rPr>
-              <w:t>—</w:t>
+              <w:t>-</w:t>
             </w:r>
           </w:p>
         </w:tc>
@@ -2783,7 +2751,7 @@
                 <w:color w:val="1F2933"/>
                 <w:sz w:val="19"/>
               </w:rPr>
-              <w:t>—</w:t>
+              <w:t>-</w:t>
             </w:r>
           </w:p>
         </w:tc>
@@ -2803,7 +2771,7 @@
                 <w:color w:val="1F2933"/>
                 <w:sz w:val="19"/>
               </w:rPr>
-              <w:t>—</w:t>
+              <w:t>-</w:t>
             </w:r>
           </w:p>
         </w:tc>
@@ -2846,7 +2814,7 @@
                 <w:color w:val="1F2933"/>
                 <w:sz w:val="19"/>
               </w:rPr>
-              <w:t>—</w:t>
+              <w:t>-</w:t>
             </w:r>
           </w:p>
         </w:tc>
@@ -2992,7 +2960,7 @@
                 <w:color w:val="1F2933"/>
                 <w:sz w:val="19"/>
               </w:rPr>
-              <w:t>—</w:t>
+              <w:t>-</w:t>
             </w:r>
           </w:p>
         </w:tc>
@@ -4073,7 +4041,7 @@
           <w:color w:val="1F2933"/>
           <w:sz w:val="21"/>
         </w:rPr>
-        <w:t>ROI = (5-yr net benefit $130K − investment $45K) ÷ $45K = 189%. Investment recovered partway through Year 2.</w:t>
+        <w:t>ROI equals (5-yr net benefit of $130K less investment of $45K) divided by $45K, which is 189%. Investment is recovered partway through Year 2.</w:t>
       </w:r>
     </w:p>
     <w:p>
@@ -4576,7 +4544,7 @@
                 <w:color w:val="1F2933"/>
                 <w:sz w:val="19"/>
               </w:rPr>
-              <w:t>&gt;140%</w:t>
+              <w:t>over 140%</w:t>
             </w:r>
           </w:p>
         </w:tc>
@@ -4613,14 +4581,6 @@
       </w:pPr>
       <w:r>
         <w:rPr>
-          <w:b w:val="0"/>
-          <w:i w:val="0"/>
-          <w:color w:val="1F2933"/>
-          <w:sz w:val="21"/>
-        </w:rPr>
-      </w:r>
-      <w:r>
-        <w:rPr>
           <w:b/>
           <w:i w:val="0"/>
           <w:color w:val="003C71"/>
@@ -4635,7 +4595,7 @@
           <w:color w:val="1F2933"/>
           <w:sz w:val="21"/>
         </w:rPr>
-        <w:t>monthly hours saved, the fully-loaded analyst rate, and one-time implementation cost. Value-positive across base and optimistic cases; the conservative case turns on higher build cost plus lower measured savings — confirm these two inputs first.</w:t>
+        <w:t>monthly hours saved, the fully-loaded analyst rate, and one-time implementation cost. The result stays value-positive across the base and optimistic cases; the conservative case turns on higher build cost plus lower measured savings, so confirm these two inputs first.</w:t>
       </w:r>
     </w:p>
     <w:p>
@@ -4661,7 +4621,7 @@
           <w:color w:val="00539B"/>
           <w:sz w:val="28"/>
         </w:rPr>
-        <w:t>Risks &amp; Mitigations</w:t>
+        <w:t>Risks and Mitigations</w:t>
       </w:r>
     </w:p>
     <w:tbl>
@@ -4832,7 +4792,7 @@
                 <w:color w:val="1F2933"/>
                 <w:sz w:val="19"/>
               </w:rPr>
-              <w:t>Robust column mapping + validation that fails clearly when structure changes</w:t>
+              <w:t>Robust column mapping plus validation that fails clearly when structure changes</w:t>
             </w:r>
           </w:p>
         </w:tc>
@@ -4935,7 +4895,7 @@
                 <w:color w:val="1F2933"/>
                 <w:sz w:val="19"/>
               </w:rPr>
-              <w:t>Fiscal Period mis-detected → wrong divisor</w:t>
+              <w:t>Fiscal Period mis-detected, wrong divisor</w:t>
             </w:r>
           </w:p>
         </w:tc>
@@ -5074,7 +5034,7 @@
                 <w:color w:val="1F2933"/>
                 <w:sz w:val="19"/>
               </w:rPr>
-              <w:t>Parallel run vs manual for 1–2 months; transparent validation report</w:t>
+              <w:t>Parallel run vs manual for 1 to 2 months; transparent validation report</w:t>
             </w:r>
           </w:p>
         </w:tc>
@@ -5361,7 +5321,7 @@
                 <w:color w:val="1F2933"/>
                 <w:sz w:val="19"/>
               </w:rPr>
-              <w:t>1. Discovery &amp; baseline</w:t>
+              <w:t>1. Discovery and baseline</w:t>
             </w:r>
           </w:p>
         </w:tc>
@@ -5399,7 +5359,7 @@
                 <w:color w:val="1F2933"/>
                 <w:sz w:val="19"/>
               </w:rPr>
-              <w:t>2–3 wks</w:t>
+              <w:t>2 to 3 wks</w:t>
             </w:r>
           </w:p>
         </w:tc>
@@ -5461,7 +5421,7 @@
                 <w:color w:val="1F2933"/>
                 <w:sz w:val="19"/>
               </w:rPr>
-              <w:t>4–6 wks</w:t>
+              <w:t>4 to 6 wks</w:t>
             </w:r>
           </w:p>
         </w:tc>
@@ -5482,7 +5442,7 @@
                 <w:color w:val="1F2933"/>
                 <w:sz w:val="19"/>
               </w:rPr>
-              <w:t>3. Dashboard &amp; commentary</w:t>
+              <w:t>3. Dashboard and commentary</w:t>
             </w:r>
           </w:p>
         </w:tc>
@@ -5542,7 +5502,7 @@
                 <w:color w:val="1F2933"/>
                 <w:sz w:val="19"/>
               </w:rPr>
-              <w:t>4. UAT &amp; parallel run</w:t>
+              <w:t>4. UAT and parallel run</w:t>
             </w:r>
           </w:p>
         </w:tc>
@@ -5562,7 +5522,7 @@
                 <w:color w:val="1F2933"/>
                 <w:sz w:val="19"/>
               </w:rPr>
-              <w:t>Validate output vs manual for 1–2 close cycles; Accounting sign-off</w:t>
+              <w:t>Validate output vs manual for 1 to 2 close cycles; Accounting sign-off</w:t>
             </w:r>
           </w:p>
         </w:tc>
@@ -5582,7 +5542,7 @@
                 <w:color w:val="1F2933"/>
                 <w:sz w:val="19"/>
               </w:rPr>
-              <w:t>2–4 wks</w:t>
+              <w:t>2 to 4 wks</w:t>
             </w:r>
           </w:p>
         </w:tc>
@@ -5603,7 +5563,7 @@
                 <w:color w:val="1F2933"/>
                 <w:sz w:val="19"/>
               </w:rPr>
-              <w:t>5. Go-live &amp; handover</w:t>
+              <w:t>5. Go-live and handover</w:t>
             </w:r>
           </w:p>
         </w:tc>
@@ -5663,7 +5623,7 @@
           <w:color w:val="1F2933"/>
           <w:sz w:val="21"/>
         </w:rPr>
-        <w:t>Indicative total: ~3–4 months, dependent on sample-data and reviewer availability.</w:t>
+        <w:t>Indicative total: about 3 to 4 months, dependent on sample-data and reviewer availability.</w:t>
       </w:r>
     </w:p>
     <w:p>
@@ -5689,7 +5649,7 @@
           <w:color w:val="00539B"/>
           <w:sz w:val="28"/>
         </w:rPr>
-        <w:t>Resource &amp; Organizational Impact</w:t>
+        <w:t>Resource and Organizational Impact</w:t>
       </w:r>
     </w:p>
     <w:p>
@@ -5704,7 +5664,7 @@
           <w:color w:val="1F2933"/>
           <w:sz w:val="21"/>
         </w:rPr>
-        <w:t>People: process owner (Stephen) for requirements &amp; UAT; a developer/automation resource for the build; Accounting for sign-off; light Finance-leadership input on the dashboard.</w:t>
+        <w:t>People: process owner (Stephen) for requirements and UAT; a developer/automation resource for the build; Accounting for sign-off; light Finance-leadership input on the dashboard.</w:t>
       </w:r>
     </w:p>
     <w:p>
@@ -5719,7 +5679,7 @@
           <w:color w:val="1F2933"/>
           <w:sz w:val="21"/>
         </w:rPr>
-        <w:t>Process change: monthly routine shifts from manual assembly to upload → confirm mapping → review validation → book. Analyst time redirected from spreadsheet maintenance to review and analysis.</w:t>
+        <w:t>Process change: monthly routine shifts from manual assembly to upload, confirm mapping, review validation, then book. Analyst time is redirected from spreadsheet maintenance to review and analysis.</w:t>
       </w:r>
     </w:p>
     <w:p>
@@ -5760,7 +5720,7 @@
           <w:color w:val="00539B"/>
           <w:sz w:val="28"/>
         </w:rPr>
-        <w:t>Dependencies &amp; Constraints</w:t>
+        <w:t>Dependencies and Constraints</w:t>
       </w:r>
     </w:p>
     <w:p>
@@ -5820,7 +5780,7 @@
           <w:color w:val="1F2933"/>
           <w:sz w:val="21"/>
         </w:rPr>
-        <w:t>Reviewer/UAT availability across 1–2 close cycles</w:t>
+        <w:t>Reviewer/UAT availability across 1 to 2 close cycles</w:t>
       </w:r>
     </w:p>
     <w:p>
@@ -5835,7 +5795,7 @@
           <w:color w:val="1F2933"/>
           <w:sz w:val="21"/>
         </w:rPr>
-        <w:t>Solution 1 limited to the two workbooks; GL Supplemental and vendor analysis are Solution 2</w:t>
+        <w:t>Solution 1 is limited to the two workbooks; GL Supplemental and vendor analysis are Solution 2</w:t>
       </w:r>
     </w:p>
     <w:p>
@@ -5954,7 +5914,7 @@
                 <w:color w:val="1F2933"/>
                 <w:sz w:val="19"/>
               </w:rPr>
-              <w:t>Manual copy/paste &amp; pivot steps eliminated</w:t>
+              <w:t>Manual copy/paste and pivot steps eliminated</w:t>
             </w:r>
           </w:p>
         </w:tc>
@@ -6034,7 +5994,7 @@
                 <w:color w:val="1F2933"/>
                 <w:sz w:val="19"/>
               </w:rPr>
-              <w:t>↓ ~85% (≈3–4 days → &lt;½ day)</w:t>
+              <w:t>Down about 85% (3 to 4 days to under half a day)</w:t>
             </w:r>
           </w:p>
         </w:tc>
@@ -6215,7 +6175,7 @@
                 <w:color w:val="1F2933"/>
                 <w:sz w:val="19"/>
               </w:rPr>
-              <w:t>↓ toward zero</w:t>
+              <w:t>Down toward zero</w:t>
             </w:r>
           </w:p>
         </w:tc>
@@ -6296,7 +6256,7 @@
                 <w:color w:val="1F2933"/>
                 <w:sz w:val="19"/>
               </w:rPr>
-              <w:t>Validation report 'screenshot included = Yes'</w:t>
+              <w:t>Validation report screenshot flag is Yes</w:t>
             </w:r>
           </w:p>
         </w:tc>
@@ -6355,7 +6315,7 @@
                 <w:color w:val="1F2933"/>
                 <w:sz w:val="19"/>
               </w:rPr>
-              <w:t>Dashboard produced &amp; reviewed by leadership</w:t>
+              <w:t>Dashboard produced and reviewed by leadership</w:t>
             </w:r>
           </w:p>
         </w:tc>
@@ -6389,21 +6349,13 @@
           <w:color w:val="00539B"/>
           <w:sz w:val="28"/>
         </w:rPr>
-        <w:t>Recommendation &amp; Next Steps</w:t>
+        <w:t>Recommendation and Next Steps</w:t>
       </w:r>
     </w:p>
     <w:p>
       <w:pPr>
         <w:spacing w:after="60"/>
       </w:pPr>
-      <w:r>
-        <w:rPr>
-          <w:b w:val="0"/>
-          <w:i w:val="0"/>
-          <w:color w:val="1F2933"/>
-          <w:sz w:val="21"/>
-        </w:rPr>
-      </w:r>
       <w:r>
         <w:rPr>
           <w:b/>
@@ -6420,7 +6372,7 @@
           <w:color w:val="1F2933"/>
           <w:sz w:val="21"/>
         </w:rPr>
-        <w:t>Proceed with Option C — build the purpose-built Commission Accrual Automation (Solution 1). It resolves the core fragilities of the current process, delivers accounting-ready and audit-supported output, and provides executive visibility, with an attractive estimated return and strong strategic (risk / audit) benefits.</w:t>
+        <w:t>Proceed with Option C, build the purpose-built Commission Accrual Automation (Solution 1). It resolves the core fragilities of the current process, delivers accounting-ready and audit-supported output, and provides executive visibility, with an attractive estimated return and strong strategic (risk and audit) benefits.</w:t>
       </w:r>
     </w:p>
     <w:p>
@@ -6450,7 +6402,7 @@
           <w:color w:val="1F2933"/>
           <w:sz w:val="21"/>
         </w:rPr>
-        <w:t>Secure sponsor approval and funding for the estimated ~$45K one-time investment.</w:t>
+        <w:t>Secure sponsor approval and funding for the estimated $45K one-time investment.</w:t>
       </w:r>
     </w:p>
     <w:p>
@@ -6506,7 +6458,7 @@
           <w:color w:val="00539B"/>
           <w:sz w:val="28"/>
         </w:rPr>
-        <w:t>Assumptions &amp; Open Questions</w:t>
+        <w:t>Assumptions and Open Questions</w:t>
       </w:r>
     </w:p>
     <w:p>
@@ -6535,7 +6487,7 @@
           <w:color w:val="1F2933"/>
           <w:sz w:val="21"/>
         </w:rPr>
-        <w:t>Current effort ≈ 3–4 senior-analyst days (~28 hrs) per month; ~85% reduction after automation.</w:t>
+        <w:t>Current effort is about 3 to 4 senior-analyst days (about 28 hrs) per month, with about 85% reduction after automation.</w:t>
       </w:r>
     </w:p>
     <w:p>
@@ -6550,7 +6502,7 @@
           <w:color w:val="1F2933"/>
           <w:sz w:val="21"/>
         </w:rPr>
-        <w:t>Fully-loaded analyst rate ≈ $65/hour.</w:t>
+        <w:t>Fully-loaded analyst rate is about $65/hour.</w:t>
       </w:r>
     </w:p>
     <w:p>
@@ -6565,7 +6517,7 @@
           <w:color w:val="1F2933"/>
           <w:sz w:val="21"/>
         </w:rPr>
-        <w:t>One-time implementation ≈ $45,000; recurring ≈ $4,000/year.</w:t>
+        <w:t>One-time implementation is about $45,000; recurring is about $4,000/year.</w:t>
       </w:r>
     </w:p>
     <w:p>
@@ -6580,7 +6532,7 @@
           <w:color w:val="1F2933"/>
           <w:sz w:val="21"/>
         </w:rPr>
-        <w:t>Error/rework reduction ≈ $8,000/year.</w:t>
+        <w:t>Error/rework reduction is about $8,000/year.</w:t>
       </w:r>
     </w:p>
     <w:p>
@@ -6610,7 +6562,7 @@
           <w:color w:val="1F2933"/>
           <w:sz w:val="21"/>
         </w:rPr>
-        <w:t>Solution is internally built/AI-assisted rather than a licensed commercial platform.</w:t>
+        <w:t>Solution is internally built or AI-assisted rather than a licensed commercial platform.</w:t>
       </w:r>
     </w:p>
     <w:p>
@@ -6639,7 +6591,7 @@
           <w:color w:val="1F2933"/>
           <w:sz w:val="21"/>
         </w:rPr>
-        <w:t>Actual implementation cost — internal build vs vendor quote?</w:t>
+        <w:t>Actual implementation cost, internal build vs vendor quote?</w:t>
       </w:r>
     </w:p>
     <w:p>
@@ -6728,7 +6680,7 @@
           <w:color w:val="52606D"/>
           <w:sz w:val="16"/>
         </w:rPr>
-        <w:t>Confidential — internal use. Generated with the reusable Business Case Generator prompt. Financial figures are illustrative estimates pending validated inputs. Hach / Veralto brand palette applied (approximate; replace with official hex codes if available).</w:t>
+        <w:t>Confidential, internal use. Generated with the reusable Business Case Generator prompt. Financial figures are illustrative estimates pending validated inputs. Hach / Veralto brand palette applied (approximate; replace with official hex codes if available).</w:t>
       </w:r>
     </w:p>
     <w:sectPr>

</xml_diff>

<commit_message>
Human-voice pass on Commission Accrual business case
Rewrite the prose blocks (exec summary, problem, cost of inaction, solution
intro, why-C-wins, financial notes, recommendation) with varied sentence
rhythm and plainer, more direct phrasing so the case reads as human-written.
Data tables and figures are unchanged. Applied to both the HTML and the
regenerated .docx.

Co-Authored-By: Claude Opus 4.8 <noreply@anthropic.com>
Claude-Session: https://claude.ai/code/session_01HHsAsYdTSfaBLKbhDayXUH
</commit_message>
<xml_diff>
--- a/cases/case-commission-accrual-automation.docx
+++ b/cases/case-commission-accrual-automation.docx
@@ -52,7 +52,7 @@
                 <w:color w:val="DCECF6"/>
                 <w:sz w:val="21"/>
               </w:rPr>
-              <w:t>Solution 1: Automating the monthly commission accrual process to produce accounting-ready, audit-supported, executive-friendly reporting.</w:t>
+              <w:t>Solution 1: replacing the manual monthly commission accrual with an automated process that hands Accounting a ready-to-book workbook, keeps the audit evidence attached, and gives leadership a clear view of the numbers.</w:t>
             </w:r>
           </w:p>
         </w:tc>
@@ -330,7 +330,7 @@
           <w:color w:val="1F2933"/>
           <w:sz w:val="21"/>
         </w:rPr>
-        <w:t>Approve development of an automated Commission Accrual solution (Solution 1) to replace the current manual, Excel-based monthly process. The initiative removes fragile pivot-table and copy-paste work, produces accounting-ready and audit-supported output, and gives Finance leadership clear month-end visibility.</w:t>
+        <w:t>Approve building an automated Commission Accrual solution (Solution 1) to replace today's manual, Excel-based routine. It takes out the fragile pivot tables and copy-paste steps and hands Accounting a workbook they can book straight away, with the audit evidence kept alongside it. Finance leadership gets a clear month-end picture without chasing it.</w:t>
       </w:r>
     </w:p>
     <w:p>
@@ -353,7 +353,7 @@
           <w:color w:val="1F2933"/>
           <w:sz w:val="21"/>
         </w:rPr>
-        <w:t>Approval of an estimated one-time implementation investment of about $45,000 and about $4,000/year recurring cost, delivered over an estimated 3 to 4 month timeline. All dollar figures are estimates pending validated inputs.</w:t>
+        <w:t>Fund a one-time build of about $45,000, plus roughly $4,000 a year to run it. The work should take three to four months. All dollar figures are estimates pending validated inputs.</w:t>
       </w:r>
     </w:p>
     <w:tbl>
@@ -600,7 +600,7 @@
           <w:color w:val="1F2933"/>
           <w:sz w:val="21"/>
         </w:rPr>
-        <w:t>Beyond the quantified return, the strongest drivers are audit readiness, reduced financial-misstatement risk, and standardized executive reporting. These are strategic benefits rather than purely cost-based ones. Automation converts several senior-analyst days each month into reliable, repeatable output that Accounting can book directly.</w:t>
+        <w:t>The dollars matter, but they are not the whole story. The bigger wins are harder to put a number on: the accrual becomes easier to audit, the risk of a misstatement drops, and leadership finally gets its reporting in a consistent format. Today the work eats several senior-analyst days a month and leans on spreadsheets that break whenever the row counts change. Automating it turns that monthly scramble into a repeatable output Accounting can book directly.</w:t>
       </w:r>
     </w:p>
     <w:tbl>
@@ -642,7 +642,7 @@
                 <w:color w:val="1F2933"/>
                 <w:sz w:val="20"/>
               </w:rPr>
-              <w:t>All dollar figures in this document are illustrative estimates built to complete the business case in the absence of confirmed cost/benefit data. Replace them with actual implementation quotes, the fully-loaded analyst rate, measured effort hours, and the finance-approved discount rate before submitting for approval. See Section 14, Assumptions and Open Questions.</w:t>
+              <w:t>Every dollar figure here is a placeholder estimate, put in so the case reads as a finished document. Before it goes forward for approval, swap them for real numbers: a build quote, the fully-loaded analyst rate, the hours the process actually takes today, and the discount rate Finance wants used. Section 14 lists what still needs confirming.</w:t>
             </w:r>
           </w:p>
         </w:tc>
@@ -690,7 +690,7 @@
           <w:color w:val="1F2933"/>
           <w:sz w:val="21"/>
         </w:rPr>
-        <w:t>Every month, Commercial Analytics generates commission reports. The process owner (Stephen) is notified, downloads the files, and manually assembles the accrual in Excel from two workbooks: Commissions Payment Made and Commissions Payment Remaining. Producing the accounting-ready workbook currently requires:</w:t>
+        <w:t>Each month, Commercial Analytics publishes the commission reports and Stephen gets a note that they are ready. He downloads the files and builds the accrual by hand in Excel, working from two workbooks: Commissions Payment Made and Commissions Payment Remaining. Getting to a workbook Accounting can book takes a long list of manual steps:</w:t>
       </w:r>
     </w:p>
     <w:p>
@@ -896,7 +896,7 @@
                 <w:color w:val="1F2933"/>
                 <w:sz w:val="20"/>
               </w:rPr>
-              <w:t>The process continues to consume an estimated 3 to 4 senior-analyst days per month, remains error-prone at the point of a financially material accrual, and offers no standardized audit trail or executive reporting. The fragility grows as transaction volumes rise, and knowledge remains concentrated in a single person.</w:t>
+              <w:t>Leave it as is and the process keeps taking an estimated three to four senior-analyst days a month. The errors also land on a number that is financially material, there is no consistent audit trail, and leadership has no real reporting to look at. It gets more fragile as volumes grow, and almost all of the know-how sits with one person.</w:t>
             </w:r>
           </w:p>
         </w:tc>
@@ -1003,7 +1003,7 @@
           <w:color w:val="1F2933"/>
           <w:sz w:val="21"/>
         </w:rPr>
-        <w:t>It also supports [STRATEGIC PRIORITY], the specific organizational priority this initiative rolls up to (for example finance transformation, close-cycle efficiency, or control/audit strengthening). Confirm and insert the correct pillar.</w:t>
+        <w:t>It should also ladder up to [STRATEGIC PRIORITY], whichever priority your org is tracking this against, for example finance transformation, a faster close, or tighter controls. Drop in the right one.</w:t>
       </w:r>
     </w:p>
     <w:p>
@@ -1043,7 +1043,7 @@
           <w:color w:val="1F2933"/>
           <w:sz w:val="21"/>
         </w:rPr>
-        <w:t>Build an automated solution that ingests the two commission workbooks, validates and maps the data, applies the established commission logic, and generates a single new, accounting-ready output workbook without overwriting the source files.</w:t>
+        <w:t>Build a tool that takes in the two commission workbooks, checks and maps the data, applies the commission logic already in use, and writes out a single new workbook that is ready for Accounting. It never touches the source files.</w:t>
       </w:r>
     </w:p>
     <w:p>
@@ -2039,7 +2039,7 @@
           <w:color w:val="1F2933"/>
           <w:sz w:val="21"/>
         </w:rPr>
-        <w:t>it eliminates the specific fragilities (copy/paste, pivot breakage, manual forecasting) while delivering the required validation, audit, and executive outputs at a fraction of the cost and integration burden of a commercial platform.</w:t>
+        <w:t>it fixes the exact things that break today (copy/paste, pivot refreshes, hand-done forecasting) and still delivers the validation, audit trail, and executive views we need, without the cost and integration effort of a full commercial platform.</w:t>
       </w:r>
     </w:p>
     <w:p>
@@ -4586,7 +4586,7 @@
           <w:color w:val="003C71"/>
           <w:sz w:val="21"/>
         </w:rPr>
-        <w:t xml:space="preserve">Most sensitive drivers: </w:t>
+        <w:t xml:space="preserve">What moves the result most: </w:t>
       </w:r>
       <w:r>
         <w:rPr>
@@ -4595,7 +4595,7 @@
           <w:color w:val="1F2933"/>
           <w:sz w:val="21"/>
         </w:rPr>
-        <w:t>monthly hours saved, the fully-loaded analyst rate, and one-time implementation cost. The result stays value-positive across the base and optimistic cases; the conservative case turns on higher build cost plus lower measured savings, so confirm these two inputs first.</w:t>
+        <w:t>the hours saved each month, the fully-loaded analyst rate, and the one-time build cost. The base and optimistic cases both stay comfortably positive. Only the conservative case gets tight, and that is a higher build cost meeting lower measured savings, so nail those two down first.</w:t>
       </w:r>
     </w:p>
     <w:p>
@@ -6372,7 +6372,7 @@
           <w:color w:val="1F2933"/>
           <w:sz w:val="21"/>
         </w:rPr>
-        <w:t>Proceed with Option C, build the purpose-built Commission Accrual Automation (Solution 1). It resolves the core fragilities of the current process, delivers accounting-ready and audit-supported output, and provides executive visibility, with an attractive estimated return and strong strategic (risk and audit) benefits.</w:t>
+        <w:t>Go with Option C and build the Commission Accrual Automation (Solution 1). It clears up the parts of the current process that break, gives Accounting output they can book and an audit trail they can stand behind, and puts a real month-end view in front of leadership. The estimated return is strong, and the risk and audit gains are worth as much as the dollars.</w:t>
       </w:r>
     </w:p>
     <w:p>

</xml_diff>